<commit_message>
Entity Recognition not working
</commit_message>
<xml_diff>
--- a/src/test/resources/inputs/Le village englouti.docx
+++ b/src/test/resources/inputs/Le village englouti.docx
@@ -135,15 +135,7 @@
     </w:p>
     <w:p>
       <w:r>
-        <w:t xml:space="preserve">Maman a </w:t>
-      </w:r>
-      <w:proofErr w:type="gramStart"/>
-      <w:r>
-        <w:t>fait</w:t>
-      </w:r>
-      <w:proofErr w:type="gramEnd"/>
-      <w:r>
-        <w:t xml:space="preserve"> des recherches. Il y avait bien un capitaine Le Floch qui avait mis son autorité pour s'opposer à la construction du barrage. Plus récemment, c'était lui encore</w:t>
+        <w:t>Maman a fait des recherches. Il y avait bien un capitaine Le Floch qui avait mis son autorité pour s'opposer à la construction du barrage. Plus récemment, c'était lui encore</w:t>
       </w:r>
       <w:r>
         <w:t xml:space="preserve"> qui</w:t>
@@ -231,11 +223,9 @@
       <w:r>
         <w:t xml:space="preserve">Quel était le lien entre le “cœur” et le village ? Le cristal gisait enfoui sous les pierres ? Toutes ces questions ne </w:t>
       </w:r>
-      <w:proofErr w:type="spellStart"/>
-      <w:r>
-        <w:t>réçurent</w:t>
-      </w:r>
-      <w:proofErr w:type="spellEnd"/>
+      <w:r>
+        <w:t>reçurent</w:t>
+      </w:r>
       <w:r>
         <w:t xml:space="preserve"> aucune réponse.</w:t>
       </w:r>

</xml_diff>